<commit_message>
Ui promene. Dodat pause menu sa resume i leave buttons i podesavanja zvuka su premestena u taj menu. Popravljeno dugme Ready u private lobby prozoru, sada funkcionise. Popravljeno glitchovanje boxova za iteme van ekrana
</commit_message>
<xml_diff>
--- a/Zombaja_Tehnicka_Specifikacija.docx
+++ b/Zombaja_Tehnicka_Specifikacija.docx
@@ -79,7 +79,14 @@
                 <w:rFonts w:cs="Arial"/>
                 <w:color w:val="FFFFFF"/>
               </w:rPr>
-              <w:t>Tim: &lt;Naziv tima&gt;</w:t>
+              <w:t xml:space="preserve">Tim: </w:t>
+            </w:r>
+            <w:r>
+              <w:rPr>
+                <w:rFonts w:cs="Arial"/>
+                <w:color w:val="FFFFFF"/>
+              </w:rPr>
+              <w:t>Zombaje</w:t>
             </w:r>
           </w:p>
           <w:p>
@@ -112,14 +119,27 @@
             <w:pPr>
               <w:spacing w:after="0"/>
               <w:jc w:val="center"/>
+              <w:rPr>
+                <w:lang w:val="sr-Latn-RS"/>
+              </w:rPr>
             </w:pPr>
             <w:r>
               <w:rPr>
                 <w:rFonts w:cs="Arial"/>
                 <w:color w:val="FFFFFF"/>
               </w:rPr>
-              <w:t>Mentor: &lt;Ime mentora&gt;</w:t>
-            </w:r>
+              <w:t xml:space="preserve">Mentor: </w:t>
+            </w:r>
+            <w:r>
+              <w:rPr>
+                <w:rFonts w:cs="Arial"/>
+                <w:color w:val="FFFFFF"/>
+                <w:lang w:val="sr-Latn-RS"/>
+              </w:rPr>
+              <w:t>Uroš Šošević</w:t>
+            </w:r>
+            <w:bookmarkStart w:id="0" w:name="_GoBack"/>
+            <w:bookmarkEnd w:id="0"/>
           </w:p>
         </w:tc>
       </w:tr>
@@ -171,15 +191,7 @@
                 <w:i/>
                 <w:color w:val="404040"/>
               </w:rPr>
-              <w:t xml:space="preserve">Ovaj dokument opisuje tehnicku arhitekturu sistema Zombaja, izabrane </w:t>
-            </w:r>
-            <w:r>
-              <w:rPr>
-                <w:rFonts w:cs="Arial"/>
-                <w:i/>
-                <w:color w:val="404040"/>
-              </w:rPr>
-              <w:t>tehnologije, mrezni protokol i sve relevantne tehnicke odluke. Sadrzaj je zasnovan na trenutnom stanju koda u repozitorijumu i sluzi kao referenca za implementaciju i za prezentaciju mentoru.</w:t>
+              <w:t>Ovaj dokument opisuje tehnicku arhitekturu sistema Zombaja, izabrane tehnologije, mrezni protokol i sve relevantne tehnicke odluke. Sadrzaj je zasnovan na trenutnom stanju koda u repozitorijumu i sluzi kao referenca za implementaciju i za prezentaciju mentoru.</w:t>
             </w:r>
           </w:p>
         </w:tc>
@@ -254,16 +266,7 @@
           <w:color w:val="2E74B5"/>
           <w:sz w:val="30"/>
         </w:rPr>
-        <w:t xml:space="preserve">1.1  Arhitekturalni </w:t>
-      </w:r>
-      <w:r>
-        <w:rPr>
-          <w:rFonts w:ascii="Arial" w:hAnsi="Arial" w:cs="Arial"/>
-          <w:b w:val="0"/>
-          <w:color w:val="2E74B5"/>
-          <w:sz w:val="30"/>
-        </w:rPr>
-        <w:t>Obrazac</w:t>
+        <w:t>1.1  Arhitekturalni Obrazac</w:t>
       </w:r>
     </w:p>
     <w:p>
@@ -274,13 +277,7 @@
         <w:rPr>
           <w:rFonts w:cs="Arial"/>
         </w:rPr>
-        <w:t xml:space="preserve">Projekat koristi Client-Server arhitekturu sa autoritativnim serverom (Authoritative Game Server). Server (Node.js proces koji pokrece server.js) je jedini koji cuva i izracunava tacno stanje igre; klijenti (HTML5 Canvas u pretrazivacu) iskljucivo </w:t>
-      </w:r>
-      <w:r>
-        <w:rPr>
-          <w:rFonts w:cs="Arial"/>
-        </w:rPr>
-        <w:t>prikazuju primljeno stanje i salju korisnicki input.</w:t>
+        <w:t>Projekat koristi Client-Server arhitekturu sa autoritativnim serverom (Authoritative Game Server). Server (Node.js proces koji pokrece server.js) je jedini koji cuva i izracunava tacno stanje igre; klijenti (HTML5 Canvas u pretrazivacu) iskljucivo prikazuju primljeno stanje i salju korisnicki input.</w:t>
       </w:r>
     </w:p>
     <w:p>
@@ -329,13 +326,7 @@
         <w:rPr>
           <w:rFonts w:cs="Arial"/>
         </w:rPr>
-        <w:t xml:space="preserve">klijent ne moze da izmeni sopstveni </w:t>
-      </w:r>
-      <w:r>
-        <w:rPr>
-          <w:rFonts w:cs="Arial"/>
-        </w:rPr>
-        <w:t>HP, novac, damage ili poziciju drugih igraca; sve provere (npr. da li je igrac fizicki u zoni prodavnice) rade se na serveru pre svake transakcije.</w:t>
+        <w:t>klijent ne moze da izmeni sopstveni HP, novac, damage ili poziciju drugih igraca; sve provere (npr. da li je igrac fizicki u zoni prodavnice) rade se na serveru pre svake transakcije.</w:t>
       </w:r>
     </w:p>
     <w:p>
@@ -354,13 +345,7 @@
         <w:rPr>
           <w:rFonts w:cs="Arial"/>
         </w:rPr>
-        <w:t xml:space="preserve">server istovremeno drzi vise nezavisnih soba (rooms), svaka sa sopstvenim igracima, </w:t>
-      </w:r>
-      <w:r>
-        <w:rPr>
-          <w:rFonts w:cs="Arial"/>
-        </w:rPr>
-        <w:t>zombijima, talasima i intervalom simulacije.</w:t>
+        <w:t>server istovremeno drzi vise nezavisnih soba (rooms), svaka sa sopstvenim igracima, zombijima, talasima i intervalom simulacije.</w:t>
       </w:r>
     </w:p>
     <w:p>
@@ -438,15 +423,20 @@
                 <w:color w:val="E6E6E6"/>
                 <w:sz w:val="18"/>
               </w:rPr>
-              <w:t xml:space="preserve">|                                                    </w:t>
-            </w:r>
+              <w:t>|                                                                 |</w:t>
+            </w:r>
+          </w:p>
+          <w:p>
+            <w:pPr>
+              <w:spacing w:after="0"/>
+            </w:pPr>
             <w:r>
               <w:rPr>
                 <w:rFonts w:ascii="Courier New" w:hAnsi="Courier New" w:cs="Courier New"/>
                 <w:color w:val="E6E6E6"/>
                 <w:sz w:val="18"/>
               </w:rPr>
-              <w:t xml:space="preserve">             |</w:t>
+              <w:t>|  http server (posluzuje staticke fajlove iz client/)          |</w:t>
             </w:r>
           </w:p>
           <w:p>
@@ -459,7 +449,7 @@
                 <w:color w:val="E6E6E6"/>
                 <w:sz w:val="18"/>
               </w:rPr>
-              <w:t>|  http server (posluzuje staticke fajlove iz client/)          |</w:t>
+              <w:t>|  WebSocketServer (biblioteka ws)                              |</w:t>
             </w:r>
           </w:p>
           <w:p>
@@ -472,7 +462,7 @@
                 <w:color w:val="E6E6E6"/>
                 <w:sz w:val="18"/>
               </w:rPr>
-              <w:t>|  WebSocketServer (biblioteka ws)                              |</w:t>
+              <w:t>|                                                                 |</w:t>
             </w:r>
           </w:p>
           <w:p>
@@ -485,7 +475,7 @@
                 <w:color w:val="E6E6E6"/>
                 <w:sz w:val="18"/>
               </w:rPr>
-              <w:t>|                                                                 |</w:t>
+              <w:t>|  +--------------+   +--------------+   +----------------------+|</w:t>
             </w:r>
           </w:p>
           <w:p>
@@ -498,15 +488,20 @@
                 <w:color w:val="E6E6E6"/>
                 <w:sz w:val="18"/>
               </w:rPr>
-              <w:t xml:space="preserve">|  +--------------+   +--------------+   </w:t>
-            </w:r>
+              <w:t>|  | RoomManager  |   |  GameLoop    |   |  Game logika         ||</w:t>
+            </w:r>
+          </w:p>
+          <w:p>
+            <w:pPr>
+              <w:spacing w:after="0"/>
+            </w:pPr>
             <w:r>
               <w:rPr>
                 <w:rFonts w:ascii="Courier New" w:hAnsi="Courier New" w:cs="Courier New"/>
                 <w:color w:val="E6E6E6"/>
                 <w:sz w:val="18"/>
               </w:rPr>
-              <w:t>+----------------------+|</w:t>
+              <w:t>|  | (sobe, igraci|   | (~33 tick/s, |   |  (guns, zombies,     ||</w:t>
             </w:r>
           </w:p>
           <w:p>
@@ -519,7 +514,7 @@
                 <w:color w:val="E6E6E6"/>
                 <w:sz w:val="18"/>
               </w:rPr>
-              <w:t>|  | RoomManager  |   |  GameLoop    |   |  Game logika         ||</w:t>
+              <w:t>|  |  po sobi)    |   |  setInterval)|   |  bullets, shop, ...) ||</w:t>
             </w:r>
           </w:p>
           <w:p>
@@ -532,7 +527,7 @@
                 <w:color w:val="E6E6E6"/>
                 <w:sz w:val="18"/>
               </w:rPr>
-              <w:t>|  | (sobe, igraci|   | (~33 tick/s, |   |  (guns, zombies,     ||</w:t>
+              <w:t>|  +--------------+   +--------------+   +----------------------+|</w:t>
             </w:r>
           </w:p>
           <w:p>
@@ -545,7 +540,7 @@
                 <w:color w:val="E6E6E6"/>
                 <w:sz w:val="18"/>
               </w:rPr>
-              <w:t>|  |  po sobi)    |   |  setInterval)|   |  bullets, shop, ...) ||</w:t>
+              <w:t>+-----------------------------+-----------------------------------+</w:t>
             </w:r>
           </w:p>
           <w:p>
@@ -558,15 +553,20 @@
                 <w:color w:val="E6E6E6"/>
                 <w:sz w:val="18"/>
               </w:rPr>
-              <w:t>|  +--------------+   +------</w:t>
-            </w:r>
+              <w:t xml:space="preserve">                              |</w:t>
+            </w:r>
+          </w:p>
+          <w:p>
+            <w:pPr>
+              <w:spacing w:after="0"/>
+            </w:pPr>
             <w:r>
               <w:rPr>
                 <w:rFonts w:ascii="Courier New" w:hAnsi="Courier New" w:cs="Courier New"/>
                 <w:color w:val="E6E6E6"/>
                 <w:sz w:val="18"/>
               </w:rPr>
-              <w:t>--------+   +----------------------+|</w:t>
+              <w:t xml:space="preserve">                    WebSocket (ws://) - JSON poruke</w:t>
             </w:r>
           </w:p>
           <w:p>
@@ -579,7 +579,7 @@
                 <w:color w:val="E6E6E6"/>
                 <w:sz w:val="18"/>
               </w:rPr>
-              <w:t>+-----------------------------+-----------------------------------+</w:t>
+              <w:t xml:space="preserve">                              |</w:t>
             </w:r>
           </w:p>
           <w:p>
@@ -592,7 +592,7 @@
                 <w:color w:val="E6E6E6"/>
                 <w:sz w:val="18"/>
               </w:rPr>
-              <w:t xml:space="preserve">                              |</w:t>
+              <w:t xml:space="preserve">        +---------------------+----------------------+</w:t>
             </w:r>
           </w:p>
           <w:p>
@@ -605,7 +605,7 @@
                 <w:color w:val="E6E6E6"/>
                 <w:sz w:val="18"/>
               </w:rPr>
-              <w:t xml:space="preserve">                    WebSocket (ws://) - JSON poruke</w:t>
+              <w:t xml:space="preserve">        |                     |                      |</w:t>
             </w:r>
           </w:p>
           <w:p>
@@ -618,7 +618,7 @@
                 <w:color w:val="E6E6E6"/>
                 <w:sz w:val="18"/>
               </w:rPr>
-              <w:t xml:space="preserve">                              |</w:t>
+              <w:t xml:space="preserve">  +-----------+         +-----------+          +-----------+</w:t>
             </w:r>
           </w:p>
           <w:p>
@@ -631,75 +631,20 @@
                 <w:color w:val="E6E6E6"/>
                 <w:sz w:val="18"/>
               </w:rPr>
-              <w:t xml:space="preserve">        +---------------------+---</w:t>
-            </w:r>
+              <w:t xml:space="preserve">  | Klijent 1 |   ...   | Klijent 2 |   ...     | Klijent N |   (do 4 po sobi)</w:t>
+            </w:r>
+          </w:p>
+          <w:p>
+            <w:pPr>
+              <w:spacing w:after="0"/>
+            </w:pPr>
             <w:r>
               <w:rPr>
                 <w:rFonts w:ascii="Courier New" w:hAnsi="Courier New" w:cs="Courier New"/>
                 <w:color w:val="E6E6E6"/>
                 <w:sz w:val="18"/>
               </w:rPr>
-              <w:t>-------------------+</w:t>
-            </w:r>
-          </w:p>
-          <w:p>
-            <w:pPr>
-              <w:spacing w:after="0"/>
-            </w:pPr>
-            <w:r>
-              <w:rPr>
-                <w:rFonts w:ascii="Courier New" w:hAnsi="Courier New" w:cs="Courier New"/>
-                <w:color w:val="E6E6E6"/>
-                <w:sz w:val="18"/>
-              </w:rPr>
-              <w:t xml:space="preserve">        |                     |                      |</w:t>
-            </w:r>
-          </w:p>
-          <w:p>
-            <w:pPr>
-              <w:spacing w:after="0"/>
-            </w:pPr>
-            <w:r>
-              <w:rPr>
-                <w:rFonts w:ascii="Courier New" w:hAnsi="Courier New" w:cs="Courier New"/>
-                <w:color w:val="E6E6E6"/>
-                <w:sz w:val="18"/>
-              </w:rPr>
-              <w:t xml:space="preserve">  +-----------+         +-----------+          +-----------+</w:t>
-            </w:r>
-          </w:p>
-          <w:p>
-            <w:pPr>
-              <w:spacing w:after="0"/>
-            </w:pPr>
-            <w:r>
-              <w:rPr>
-                <w:rFonts w:ascii="Courier New" w:hAnsi="Courier New" w:cs="Courier New"/>
-                <w:color w:val="E6E6E6"/>
-                <w:sz w:val="18"/>
-              </w:rPr>
-              <w:t xml:space="preserve">  | Klijent 1 |   ...   | Klijent 2 |   ...     | Klijent N |   (do 4 po sobi)</w:t>
-            </w:r>
-          </w:p>
-          <w:p>
-            <w:pPr>
-              <w:spacing w:after="0"/>
-            </w:pPr>
-            <w:r>
-              <w:rPr>
-                <w:rFonts w:ascii="Courier New" w:hAnsi="Courier New" w:cs="Courier New"/>
-                <w:color w:val="E6E6E6"/>
-                <w:sz w:val="18"/>
-              </w:rPr>
-              <w:t xml:space="preserve">  | Browser   |         | Browser   |   </w:t>
-            </w:r>
-            <w:r>
-              <w:rPr>
-                <w:rFonts w:ascii="Courier New" w:hAnsi="Courier New" w:cs="Courier New"/>
-                <w:color w:val="E6E6E6"/>
-                <w:sz w:val="18"/>
-              </w:rPr>
-              <w:t xml:space="preserve">        | Browser   |</w:t>
+              <w:t xml:space="preserve">  | Browser   |         | Browser   |           | Browser   |</w:t>
             </w:r>
           </w:p>
           <w:p>
@@ -901,14 +846,7 @@
                 <w:rFonts w:cs="Arial"/>
                 <w:sz w:val="19"/>
               </w:rPr>
-              <w:t>Kreiranje i pronalazenje soba (javne</w:t>
-            </w:r>
-            <w:r>
-              <w:rPr>
-                <w:rFonts w:cs="Arial"/>
-                <w:sz w:val="19"/>
-              </w:rPr>
-              <w:t xml:space="preserve"> i privatne), evidencija igraca i WS konekcija po sobi</w:t>
+              <w:t>Kreiranje i pronalazenje soba (javne i privatne), evidencija igraca i WS konekcija po sobi</w:t>
             </w:r>
           </w:p>
         </w:tc>
@@ -1062,14 +1000,7 @@
                 <w:rFonts w:cs="Arial"/>
                 <w:sz w:val="19"/>
               </w:rPr>
-              <w:t xml:space="preserve">Tick logika (30 ms): pucanje, </w:t>
-            </w:r>
-            <w:r>
-              <w:rPr>
-                <w:rFonts w:cs="Arial"/>
-                <w:sz w:val="19"/>
-              </w:rPr>
-              <w:t>zombiji, meci, kolizije, talasi, broadcast stanja</w:t>
+              <w:t>Tick logika (30 ms): pucanje, zombiji, meci, kolizije, talasi, broadcast stanja</w:t>
             </w:r>
           </w:p>
         </w:tc>
@@ -1224,14 +1155,7 @@
                 <w:rFonts w:cs="Arial"/>
                 <w:sz w:val="19"/>
               </w:rPr>
-              <w:t xml:space="preserve">Kretanje metaka, kolizija </w:t>
-            </w:r>
-            <w:r>
-              <w:rPr>
-                <w:rFonts w:cs="Arial"/>
-                <w:sz w:val="19"/>
-              </w:rPr>
-              <w:t>sa zidovima, igracima i zombijima, primena efekata pogotka</w:t>
+              <w:t>Kretanje metaka, kolizija sa zidovima, igracima i zombijima, primena efekata pogotka</w:t>
             </w:r>
           </w:p>
         </w:tc>
@@ -1385,14 +1309,7 @@
                 <w:rFonts w:cs="Arial"/>
                 <w:sz w:val="19"/>
               </w:rPr>
-              <w:t xml:space="preserve">Medkit / adrenalin / SPAS pilula, kroz mehanizam </w:t>
-            </w:r>
-            <w:r>
-              <w:rPr>
-                <w:rFonts w:cs="Arial"/>
-                <w:sz w:val="19"/>
-              </w:rPr>
-              <w:t>kanalisanja (channeling)</w:t>
+              <w:t>Medkit / adrenalin / SPAS pilula, kroz mehanizam kanalisanja (channeling)</w:t>
             </w:r>
           </w:p>
         </w:tc>
@@ -1931,14 +1848,7 @@
                 <w:rFonts w:cs="Arial"/>
                 <w:sz w:val="19"/>
               </w:rPr>
-              <w:t xml:space="preserve">Tastatura i mis, lokalna </w:t>
-            </w:r>
-            <w:r>
-              <w:rPr>
-                <w:rFonts w:cs="Arial"/>
-                <w:sz w:val="19"/>
-              </w:rPr>
-              <w:t>predikcija kretanja (60 FPS), slanje inputa</w:t>
+              <w:t>Tastatura i mis, lokalna predikcija kretanja (60 FPS), slanje inputa</w:t>
             </w:r>
           </w:p>
         </w:tc>
@@ -2443,14 +2353,7 @@
                 <w:rFonts w:cs="Arial"/>
                 <w:sz w:val="19"/>
               </w:rPr>
-              <w:t xml:space="preserve">Laka biblioteka bez </w:t>
-            </w:r>
-            <w:r>
-              <w:rPr>
-                <w:rFonts w:cs="Arial"/>
-                <w:sz w:val="19"/>
-              </w:rPr>
-              <w:t>dodatnog protokola iznad WebSocket-a, za razliku od Socket.io</w:t>
+              <w:t>Laka biblioteka bez dodatnog protokola iznad WebSocket-a, za razliku od Socket.io</w:t>
             </w:r>
           </w:p>
         </w:tc>
@@ -2652,14 +2555,7 @@
                 <w:rFonts w:cs="Arial"/>
                 <w:sz w:val="19"/>
               </w:rPr>
-              <w:t xml:space="preserve">Citljivo za debagovanje, nativna </w:t>
-            </w:r>
-            <w:r>
-              <w:rPr>
-                <w:rFonts w:cs="Arial"/>
-                <w:sz w:val="19"/>
-              </w:rPr>
-              <w:t>podrska u JavaScript-u (JSON.stringify / JSON.parse) na oba kraja</w:t>
+              <w:t>Citljivo za debagovanje, nativna podrska u JavaScript-u (JSON.stringify / JSON.parse) na oba kraja</w:t>
             </w:r>
           </w:p>
         </w:tc>
@@ -2789,14 +2685,7 @@
                 <w:rFonts w:cs="Arial"/>
                 <w:sz w:val="19"/>
               </w:rPr>
-              <w:t xml:space="preserve">Server </w:t>
-            </w:r>
-            <w:r>
-              <w:rPr>
-                <w:rFonts w:cs="Arial"/>
-                <w:sz w:val="19"/>
-              </w:rPr>
-              <w:t>staticnih fajlova</w:t>
+              <w:t>Server staticnih fajlova</w:t>
             </w:r>
           </w:p>
         </w:tc>
@@ -3022,14 +2911,7 @@
                 <w:rFonts w:cs="Arial"/>
                 <w:sz w:val="19"/>
               </w:rPr>
-              <w:t xml:space="preserve">Nije </w:t>
-            </w:r>
-            <w:r>
-              <w:rPr>
-                <w:rFonts w:cs="Arial"/>
-                <w:sz w:val="19"/>
-              </w:rPr>
-              <w:t>trenutno implementirano</w:t>
+              <w:t>Nije trenutno implementirano</w:t>
             </w:r>
           </w:p>
         </w:tc>
@@ -3201,16 +3083,7 @@
           <w:color w:val="2E74B5"/>
           <w:sz w:val="30"/>
         </w:rPr>
-        <w:t xml:space="preserve">2.2  Razmatrane </w:t>
-      </w:r>
-      <w:r>
-        <w:rPr>
-          <w:rFonts w:ascii="Arial" w:hAnsi="Arial" w:cs="Arial"/>
-          <w:b w:val="0"/>
-          <w:color w:val="2E74B5"/>
-          <w:sz w:val="30"/>
-        </w:rPr>
-        <w:t>Alternative</w:t>
+        <w:t>2.2  Razmatrane Alternative</w:t>
       </w:r>
     </w:p>
     <w:tbl>
@@ -3601,15 +3474,7 @@
                 <w:i/>
                 <w:color w:val="404040"/>
               </w:rPr>
-              <w:t xml:space="preserve">Sve poruke su JSON objekti koji se salju kao tekstualni WebSocket </w:t>
-            </w:r>
-            <w:r>
-              <w:rPr>
-                <w:rFonts w:cs="Arial"/>
-                <w:i/>
-                <w:color w:val="404040"/>
-              </w:rPr>
-              <w:t>frame-ovi. Svaka poruka sadrzi obavezno polje 'type' koje identifikuje vrstu poruke. Sve poruke koje menjaju stanje igre (kupovina, pucanje, kretanje...) validira iskljucivo server.</w:t>
+              <w:t>Sve poruke su JSON objekti koji se salju kao tekstualni WebSocket frame-ovi. Svaka poruka sadrzi obavezno polje 'type' koje identifikuje vrstu poruke. Sve poruke koje menjaju stanje igre (kupovina, pucanje, kretanje...) validira iskljucivo server.</w:t>
             </w:r>
           </w:p>
         </w:tc>
@@ -3647,16 +3512,7 @@
           <w:color w:val="2E74B5"/>
           <w:sz w:val="24"/>
         </w:rPr>
-        <w:t>create_lobby / join_public / join  -  Pridruzivan</w:t>
-      </w:r>
-      <w:r>
-        <w:rPr>
-          <w:rFonts w:ascii="Arial" w:hAnsi="Arial" w:cs="Arial"/>
-          <w:b w:val="0"/>
-          <w:color w:val="2E74B5"/>
-          <w:sz w:val="24"/>
-        </w:rPr>
-        <w:t>je sobi</w:t>
+        <w:t>create_lobby / join_public / join  -  Pridruzivanje sobi</w:t>
       </w:r>
     </w:p>
     <w:p>
@@ -3865,16 +3721,7 @@
           <w:color w:val="2E74B5"/>
           <w:sz w:val="24"/>
         </w:rPr>
-        <w:t xml:space="preserve">start_game  -  </w:t>
-      </w:r>
-      <w:r>
-        <w:rPr>
-          <w:rFonts w:ascii="Arial" w:hAnsi="Arial" w:cs="Arial"/>
-          <w:b w:val="0"/>
-          <w:color w:val="2E74B5"/>
-          <w:sz w:val="24"/>
-        </w:rPr>
-        <w:t>Pokretanje igre</w:t>
+        <w:t>start_game  -  Pokretanje igre</w:t>
       </w:r>
     </w:p>
     <w:p>
@@ -4229,13 +4076,7 @@
         <w:rPr>
           <w:rFonts w:cs="Arial"/>
         </w:rPr>
-        <w:t>weapon je i</w:t>
-      </w:r>
-      <w:r>
-        <w:rPr>
-          <w:rFonts w:cs="Arial"/>
-        </w:rPr>
-        <w:t>ndeks oruzja: 0 = pistolj, 1 = sacmara, 2 = pusks, 3 = granata.</w:t>
+        <w:t>weapon je indeks oruzja: 0 = pistolj, 1 = sacmara, 2 = pusks, 3 = granata.</w:t>
       </w:r>
     </w:p>
     <w:tbl>
@@ -4433,16 +4274,7 @@
           <w:color w:val="2E74B5"/>
           <w:sz w:val="24"/>
         </w:rPr>
-        <w:t xml:space="preserve">buy_weapon / upgrade_weapon / buy_ammo  -  </w:t>
-      </w:r>
-      <w:r>
-        <w:rPr>
-          <w:rFonts w:ascii="Arial" w:hAnsi="Arial" w:cs="Arial"/>
-          <w:b w:val="0"/>
-          <w:color w:val="2E74B5"/>
-          <w:sz w:val="24"/>
-        </w:rPr>
-        <w:t>Kupovina oruzja i municije</w:t>
+        <w:t>buy_weapon / upgrade_weapon / buy_ammo  -  Kupovina oruzja i municije</w:t>
       </w:r>
     </w:p>
     <w:p>
@@ -4602,15 +4434,7 @@
                 <w:color w:val="E6E6E6"/>
                 <w:sz w:val="18"/>
               </w:rPr>
-              <w:t xml:space="preserve">  "type": "buy_consum</w:t>
-            </w:r>
-            <w:r>
-              <w:rPr>
-                <w:rFonts w:ascii="Courier New" w:hAnsi="Courier New" w:cs="Courier New"/>
-                <w:color w:val="E6E6E6"/>
-                <w:sz w:val="18"/>
-              </w:rPr>
-              <w:t>able",</w:t>
+              <w:t xml:space="preserve">  "type": "buy_consumable",</w:t>
             </w:r>
           </w:p>
           <w:p>
@@ -4770,14 +4594,7 @@
           <w:rFonts w:cs="Arial"/>
           <w:i/>
         </w:rPr>
-        <w:t xml:space="preserve">Napomena: igra trenutno nema formalni 'game over' uslov. Talasi zombija se nastavljaju beskonacno (broj talasa raste bez gornje </w:t>
-      </w:r>
-      <w:r>
-        <w:rPr>
-          <w:rFonts w:cs="Arial"/>
-          <w:i/>
-        </w:rPr>
-        <w:t>granice); igrac koji izgubi sav HP samo umire i automatski se respawnuje posle 3 sekunde (server/game/playerLifecycle.js).</w:t>
+        <w:t>Napomena: igra trenutno nema formalni 'game over' uslov. Talasi zombija se nastavljaju beskonacno (broj talasa raste bez gornje granice); igrac koji izgubi sav HP samo umire i automatski se respawnuje posle 3 sekunde (server/game/playerLifecycle.js).</w:t>
       </w:r>
     </w:p>
     <w:p>
@@ -4804,13 +4621,7 @@
         <w:rPr>
           <w:rFonts w:cs="Arial"/>
         </w:rPr>
-        <w:t>Salje se jednom, odmah po ulasku; sadrzi sve staticke podatke potrebne klijentu (zidov</w:t>
-      </w:r>
-      <w:r>
-        <w:rPr>
-          <w:rFonts w:cs="Arial"/>
-        </w:rPr>
-        <w:t>i, zona prodavnice, konfiguracija oruzja i potrosnih itema).</w:t>
+        <w:t>Salje se jednom, odmah po ulasku; sadrzi sve staticke podatke potrebne klijentu (zidovi, zona prodavnice, konfiguracija oruzja i potrosnih itema).</w:t>
       </w:r>
     </w:p>
     <w:tbl>
@@ -5136,15 +4947,7 @@
                 <w:color w:val="E6E6E6"/>
                 <w:sz w:val="18"/>
               </w:rPr>
-              <w:t xml:space="preserve">  "type": "lobby_up</w:t>
-            </w:r>
-            <w:r>
-              <w:rPr>
-                <w:rFonts w:ascii="Courier New" w:hAnsi="Courier New" w:cs="Courier New"/>
-                <w:color w:val="E6E6E6"/>
-                <w:sz w:val="18"/>
-              </w:rPr>
-              <w:t>date",</w:t>
+              <w:t xml:space="preserve">  "type": "lobby_update",</w:t>
             </w:r>
           </w:p>
           <w:p>
@@ -5316,13 +5119,7 @@
         <w:rPr>
           <w:rFonts w:cs="Arial"/>
         </w:rPr>
-        <w:t xml:space="preserve">Kompletan snapshot sobe; </w:t>
-      </w:r>
-      <w:r>
-        <w:rPr>
-          <w:rFonts w:cs="Arial"/>
-        </w:rPr>
-        <w:t>klijent ga koristi da uskladi lokalno stanje sa serverom (vidi sekciju 4.1).</w:t>
+        <w:t>Kompletan snapshot sobe; klijent ga koristi da uskladi lokalno stanje sa serverom (vidi sekciju 4.1).</w:t>
       </w:r>
     </w:p>
     <w:tbl>
@@ -5500,16 +5297,7 @@
           <w:sz w:val="24"/>
         </w:rPr>
         <w:lastRenderedPageBreak/>
-        <w:t xml:space="preserve">hit_feedback / </w:t>
-      </w:r>
-      <w:r>
-        <w:rPr>
-          <w:rFonts w:ascii="Arial" w:hAnsi="Arial" w:cs="Arial"/>
-          <w:b w:val="0"/>
-          <w:color w:val="2E74B5"/>
-          <w:sz w:val="24"/>
-        </w:rPr>
-        <w:t>zombie_hit / zombie_death  -  Povratna informacija o pogocima</w:t>
+        <w:t>hit_feedback / zombie_hit / zombie_death  -  Povratna informacija o pogocima</w:t>
       </w:r>
     </w:p>
     <w:tbl>
@@ -5645,13 +5433,7 @@
         <w:rPr>
           <w:rFonts w:cs="Arial"/>
         </w:rPr>
-        <w:t xml:space="preserve">Klijent ih koristi da odsvira odgovarajuci zvuk </w:t>
-      </w:r>
-      <w:r>
-        <w:rPr>
-          <w:rFonts w:cs="Arial"/>
-        </w:rPr>
-        <w:t>(jacina zavisi od udaljenosti izvora, vidi client/connection/gameState.js).</w:t>
+        <w:t>Klijent ih koristi da odsvira odgovarajuci zvuk (jacina zavisi od udaljenosti izvora, vidi client/connection/gameState.js).</w:t>
       </w:r>
     </w:p>
     <w:tbl>
@@ -6343,14 +6125,7 @@
                 <w:rFonts w:cs="Arial"/>
                 <w:sz w:val="19"/>
               </w:rPr>
-              <w:t xml:space="preserve">Ne postoji eksplicitni bafer po tick-u; poruke igraca (move, shoot_*, weapon_change...) menjaju stanje igraca odmah po </w:t>
-            </w:r>
-            <w:r>
-              <w:rPr>
-                <w:rFonts w:cs="Arial"/>
-                <w:sz w:val="19"/>
-              </w:rPr>
-              <w:t>prijemu. Sledeci tick samo simulira posledice (fizika, kolizije, AI) na osnovu trenutnog stanja.</w:t>
+              <w:t>Ne postoji eksplicitni bafer po tick-u; poruke igraca (move, shoot_*, weapon_change...) menjaju stanje igraca odmah po prijemu. Sledeci tick samo simulira posledice (fizika, kolizije, AI) na osnovu trenutnog stanja.</w:t>
             </w:r>
           </w:p>
         </w:tc>
@@ -6456,14 +6231,7 @@
                 <w:rFonts w:cs="Arial"/>
                 <w:sz w:val="19"/>
               </w:rPr>
-              <w:t xml:space="preserve">Klijent radi </w:t>
-            </w:r>
-            <w:r>
-              <w:rPr>
-                <w:rFonts w:cs="Arial"/>
-                <w:sz w:val="19"/>
-              </w:rPr>
-              <w:t>lokalnu predikciju kretanja na 60 FPS (client/logic/input.js). Pozicija lokalnog igraca se korigure sa servera samo ako odstupanje predje 60 px; server ostaje autoritet za HP, novac, oruzje i sve ostalo.</w:t>
+              <w:t>Klijent radi lokalnu predikciju kretanja na 60 FPS (client/logic/input.js). Pozicija lokalnog igraca se korigure sa servera samo ako odstupanje predje 60 px; server ostaje autoritet za HP, novac, oruzje i sve ostalo.</w:t>
             </w:r>
           </w:p>
         </w:tc>
@@ -6516,14 +6284,7 @@
                 <w:rFonts w:cs="Arial"/>
                 <w:sz w:val="19"/>
               </w:rPr>
-              <w:t xml:space="preserve">Node.js, setInterval(tick, 30) u </w:t>
-            </w:r>
-            <w:r>
-              <w:rPr>
-                <w:rFonts w:cs="Arial"/>
-                <w:sz w:val="19"/>
-              </w:rPr>
-              <w:t>server/game/gameLoop.js</w:t>
+              <w:t>Node.js, setInterval(tick, 30) u server/game/gameLoop.js</w:t>
             </w:r>
           </w:p>
         </w:tc>
@@ -6570,13 +6331,7 @@
         <w:rPr>
           <w:rFonts w:cs="Arial"/>
         </w:rPr>
-        <w:t>updateConsumables - azurira kanalisanje (koriscenje medkit / ad</w:t>
-      </w:r>
-      <w:r>
-        <w:rPr>
-          <w:rFonts w:cs="Arial"/>
-        </w:rPr>
-        <w:t>renalin / SPAS) i pasivni efekat adrenalina (regeneracija HP, opadanje bara).</w:t>
+        <w:t>updateConsumables - azurira kanalisanje (koriscenje medkit / adrenalin / SPAS) i pasivni efekat adrenalina (regeneracija HP, opadanje bara).</w:t>
       </w:r>
     </w:p>
     <w:p>
@@ -6600,13 +6355,7 @@
         <w:rPr>
           <w:rFonts w:cs="Arial"/>
         </w:rPr>
-        <w:t xml:space="preserve">updateFireZones - azurira zone </w:t>
-      </w:r>
-      <w:r>
-        <w:rPr>
-          <w:rFonts w:cs="Arial"/>
-        </w:rPr>
-        <w:t>vatre nastale od granata i dodeljuje efekat gorenja zombijima koji se u njima nalaze.</w:t>
+        <w:t>updateFireZones - azurira zone vatre nastale od granata i dodeljuje efekat gorenja zombijima koji se u njima nalaze.</w:t>
       </w:r>
     </w:p>
     <w:p>
@@ -6630,13 +6379,7 @@
         <w:rPr>
           <w:rFonts w:cs="Arial"/>
         </w:rPr>
-        <w:t>checkCollisions</w:t>
-      </w:r>
-      <w:r>
-        <w:rPr>
-          <w:rFonts w:cs="Arial"/>
-        </w:rPr>
-        <w:t xml:space="preserve"> - proverava koliziju metaka sa igracima i zombijima, primenjuje stetu i efekte oruzja (kriticni udarac, odbacivanje, omamljivanje, probijanje, krvarenje).</w:t>
+        <w:t>checkCollisions - proverava koliziju metaka sa igracima i zombijima, primenjuje stetu i efekte oruzja (kriticni udarac, odbacivanje, omamljivanje, probijanje, krvarenje).</w:t>
       </w:r>
     </w:p>
     <w:p>
@@ -6648,13 +6391,7 @@
         <w:rPr>
           <w:rFonts w:cs="Arial"/>
         </w:rPr>
-        <w:t>checkWaveProgress - proverava da li je talas zavrsen (svi zombiji mrtvi ili isteklo vreme cekanja) i</w:t>
-      </w:r>
-      <w:r>
-        <w:rPr>
-          <w:rFonts w:cs="Arial"/>
-        </w:rPr>
-        <w:t xml:space="preserve"> po potrebi pokrece sledeci talas.</w:t>
+        <w:t>checkWaveProgress - proverava da li je talas zavrsen (svi zombiji mrtvi ili isteklo vreme cekanja) i po potrebi pokrece sledeci talas.</w:t>
       </w:r>
     </w:p>
     <w:p>
@@ -6858,14 +6595,7 @@
                 <w:rFonts w:cs="Arial"/>
                 <w:sz w:val="19"/>
               </w:rPr>
-              <w:t xml:space="preserve">checkWallCollision proverava </w:t>
-            </w:r>
-            <w:r>
-              <w:rPr>
-                <w:rFonts w:cs="Arial"/>
-                <w:sz w:val="19"/>
-              </w:rPr>
-              <w:t>hitbox 20x20 px igraca protiv liste pravougaonih zidova (server/world/map.js)</w:t>
+              <w:t>checkWallCollision proverava hitbox 20x20 px igraca protiv liste pravougaonih zidova (server/world/map.js)</w:t>
             </w:r>
           </w:p>
         </w:tc>
@@ -7019,14 +6749,7 @@
                 <w:rFonts w:cs="Arial"/>
                 <w:sz w:val="19"/>
               </w:rPr>
-              <w:t xml:space="preserve">Metak se </w:t>
-            </w:r>
-            <w:r>
-              <w:rPr>
-                <w:rFonts w:cs="Arial"/>
-                <w:sz w:val="19"/>
-              </w:rPr>
-              <w:t>unistava pri prvom kontaktu sa zidom</w:t>
+              <w:t>Metak se unistava pri prvom kontaktu sa zidom</w:t>
             </w:r>
           </w:p>
         </w:tc>
@@ -7198,14 +6921,7 @@
                 <w:rFonts w:cs="Arial"/>
                 <w:sz w:val="19"/>
               </w:rPr>
-              <w:t xml:space="preserve">Glavni </w:t>
-            </w:r>
-            <w:r>
-              <w:rPr>
-                <w:rFonts w:cs="Arial"/>
-                <w:sz w:val="19"/>
-              </w:rPr>
-              <w:t>mehanizam nanosenja stete; ovde se racunaju svi bonus efekti oruzja (kriticni udarac, probijanje...)</w:t>
+              <w:t>Glavni mehanizam nanosenja stete; ovde se racunaju svi bonus efekti oruzja (kriticni udarac, probijanje...)</w:t>
             </w:r>
           </w:p>
         </w:tc>
@@ -7282,14 +6998,7 @@
                 <w:rFonts w:cs="Arial"/>
                 <w:sz w:val="19"/>
               </w:rPr>
-              <w:t>Nanosi 5 stete po tick-u (2.5 ako zombi gori); tip 'explode' se unistava odmah p</w:t>
-            </w:r>
-            <w:r>
-              <w:rPr>
-                <w:rFonts w:cs="Arial"/>
-                <w:sz w:val="19"/>
-              </w:rPr>
-              <w:t>ri kontaktu</w:t>
+              <w:t>Nanosi 5 stete po tick-u (2.5 ako zombi gori); tip 'explode' se unistava odmah pri kontaktu</w:t>
             </w:r>
           </w:p>
         </w:tc>
@@ -7441,16 +7150,7 @@
           <w:color w:val="2E74B5"/>
           <w:sz w:val="30"/>
         </w:rPr>
-        <w:t xml:space="preserve">5.1  Folder Struktura </w:t>
-      </w:r>
-      <w:r>
-        <w:rPr>
-          <w:rFonts w:ascii="Arial" w:hAnsi="Arial" w:cs="Arial"/>
-          <w:b w:val="0"/>
-          <w:color w:val="2E74B5"/>
-          <w:sz w:val="30"/>
-        </w:rPr>
-        <w:t>Repozitorijuma</w:t>
+        <w:t>5.1  Folder Struktura Repozitorijuma</w:t>
       </w:r>
     </w:p>
     <w:tbl>
@@ -7552,15 +7252,20 @@
                 <w:color w:val="E6E6E6"/>
                 <w:sz w:val="18"/>
               </w:rPr>
-              <w:t>|   |   `-- constants.js        &lt;- Dimenzije sveta, max igraca po so</w:t>
-            </w:r>
+              <w:t>|   |   `-- constants.js        &lt;- Dimenzije sveta, max igraca po sobi</w:t>
+            </w:r>
+          </w:p>
+          <w:p>
+            <w:pPr>
+              <w:spacing w:after="0"/>
+            </w:pPr>
             <w:r>
               <w:rPr>
                 <w:rFonts w:ascii="Courier New" w:hAnsi="Courier New" w:cs="Courier New"/>
                 <w:color w:val="E6E6E6"/>
                 <w:sz w:val="18"/>
               </w:rPr>
-              <w:t>bi</w:t>
+              <w:t>|   |-- game/</w:t>
             </w:r>
           </w:p>
           <w:p>
@@ -7573,7 +7278,7 @@
                 <w:color w:val="E6E6E6"/>
                 <w:sz w:val="18"/>
               </w:rPr>
-              <w:t>|   |-- game/</w:t>
+              <w:t>|   |   |-- gameLoop.js         &lt;- Tick logika i talasi</w:t>
             </w:r>
           </w:p>
           <w:p>
@@ -7586,7 +7291,7 @@
                 <w:color w:val="E6E6E6"/>
                 <w:sz w:val="18"/>
               </w:rPr>
-              <w:t>|   |   |-- gameLoop.js         &lt;- Tick logika i talasi</w:t>
+              <w:t>|   |   |-- guns.js             &lt;- Ispaljivanje oruzja i eksplozije</w:t>
             </w:r>
           </w:p>
           <w:p>
@@ -7599,7 +7304,7 @@
                 <w:color w:val="E6E6E6"/>
                 <w:sz w:val="18"/>
               </w:rPr>
-              <w:t>|   |   |-- guns.js             &lt;- Ispaljivanje oruzja i eksplozije</w:t>
+              <w:t>|   |   |-- weaponConfig.js     &lt;- Balans oruzja po nivoima</w:t>
             </w:r>
           </w:p>
           <w:p>
@@ -7612,7 +7317,7 @@
                 <w:color w:val="E6E6E6"/>
                 <w:sz w:val="18"/>
               </w:rPr>
-              <w:t>|   |   |-- weaponConfig.js     &lt;- Balans oruzja po nivoima</w:t>
+              <w:t>|   |   |-- bullets.js          &lt;- Kretanje i kolizija metaka</w:t>
             </w:r>
           </w:p>
           <w:p>
@@ -7625,15 +7330,20 @@
                 <w:color w:val="E6E6E6"/>
                 <w:sz w:val="18"/>
               </w:rPr>
-              <w:t xml:space="preserve">|   |   |-- bullets.js          &lt;- Kretanje i kolizija </w:t>
-            </w:r>
+              <w:t>|   |   |-- zombies.js          &lt;- AI i status efekti zombija</w:t>
+            </w:r>
+          </w:p>
+          <w:p>
+            <w:pPr>
+              <w:spacing w:after="0"/>
+            </w:pPr>
             <w:r>
               <w:rPr>
                 <w:rFonts w:ascii="Courier New" w:hAnsi="Courier New" w:cs="Courier New"/>
                 <w:color w:val="E6E6E6"/>
                 <w:sz w:val="18"/>
               </w:rPr>
-              <w:t>metaka</w:t>
+              <w:t>|   |   |-- consumables.js      &lt;- Medkit / adrenalin / SPAS</w:t>
             </w:r>
           </w:p>
           <w:p>
@@ -7646,7 +7356,7 @@
                 <w:color w:val="E6E6E6"/>
                 <w:sz w:val="18"/>
               </w:rPr>
-              <w:t>|   |   |-- zombies.js          &lt;- AI i status efekti zombija</w:t>
+              <w:t>|   |   |-- scoring.js          &lt;- Bodovi i combo multiplikator</w:t>
             </w:r>
           </w:p>
           <w:p>
@@ -7659,7 +7369,7 @@
                 <w:color w:val="E6E6E6"/>
                 <w:sz w:val="18"/>
               </w:rPr>
-              <w:t>|   |   |-- consumables.js      &lt;- Medkit / adrenalin / SPAS</w:t>
+              <w:t>|   |   |-- shotTracking.js     &lt;- Pracenje pogodaka po hicu</w:t>
             </w:r>
           </w:p>
           <w:p>
@@ -7672,7 +7382,7 @@
                 <w:color w:val="E6E6E6"/>
                 <w:sz w:val="18"/>
               </w:rPr>
-              <w:t>|   |   |-- scoring.js          &lt;- Bodovi i combo multiplikator</w:t>
+              <w:t>|   |   |-- playerLifecycle.js  &lt;- Smrt i respawn igraca</w:t>
             </w:r>
           </w:p>
           <w:p>
@@ -7685,7 +7395,7 @@
                 <w:color w:val="E6E6E6"/>
                 <w:sz w:val="18"/>
               </w:rPr>
-              <w:t>|   |   |-- shotTracking.js     &lt;- Pracenje pogodaka po hicu</w:t>
+              <w:t>|   |   `-- broadcast.js        &lt;- Slanje poruka klijentima</w:t>
             </w:r>
           </w:p>
           <w:p>
@@ -7698,15 +7408,20 @@
                 <w:color w:val="E6E6E6"/>
                 <w:sz w:val="18"/>
               </w:rPr>
-              <w:t>|</w:t>
-            </w:r>
+              <w:t>|   |-- network/</w:t>
+            </w:r>
+          </w:p>
+          <w:p>
+            <w:pPr>
+              <w:spacing w:after="0"/>
+            </w:pPr>
             <w:r>
               <w:rPr>
                 <w:rFonts w:ascii="Courier New" w:hAnsi="Courier New" w:cs="Courier New"/>
                 <w:color w:val="E6E6E6"/>
                 <w:sz w:val="18"/>
               </w:rPr>
-              <w:t xml:space="preserve">   |   |-- playerLifecycle.js  &lt;- Smrt i respawn igraca</w:t>
+              <w:t>|   |   `-- websocket.js        &lt;- Dispecovanje poruka od klijenata</w:t>
             </w:r>
           </w:p>
           <w:p>
@@ -7719,7 +7434,7 @@
                 <w:color w:val="E6E6E6"/>
                 <w:sz w:val="18"/>
               </w:rPr>
-              <w:t>|   |   `-- broadcast.js        &lt;- Slanje poruka klijentima</w:t>
+              <w:t>|   |-- rooms/</w:t>
             </w:r>
           </w:p>
           <w:p>
@@ -7732,7 +7447,7 @@
                 <w:color w:val="E6E6E6"/>
                 <w:sz w:val="18"/>
               </w:rPr>
-              <w:t>|   |-- network/</w:t>
+              <w:t>|   |   `-- roomManager.js      &lt;- Sobe, igraci, WS konekcije</w:t>
             </w:r>
           </w:p>
           <w:p>
@@ -7745,7 +7460,7 @@
                 <w:color w:val="E6E6E6"/>
                 <w:sz w:val="18"/>
               </w:rPr>
-              <w:t>|   |   `-- websocket.js        &lt;- Dispecovanje poruka od klijenata</w:t>
+              <w:t>|   |-- world/</w:t>
             </w:r>
           </w:p>
           <w:p>
@@ -7758,7 +7473,7 @@
                 <w:color w:val="E6E6E6"/>
                 <w:sz w:val="18"/>
               </w:rPr>
-              <w:t>|   |-- rooms/</w:t>
+              <w:t>|   |   `-- map.js              &lt;- Zidovi, spawn tacke, zona prodavnice</w:t>
             </w:r>
           </w:p>
           <w:p>
@@ -7771,15 +7486,20 @@
                 <w:color w:val="E6E6E6"/>
                 <w:sz w:val="18"/>
               </w:rPr>
-              <w:t>|   |   `-- roomManager.js      &lt;- Sobe,</w:t>
-            </w:r>
+              <w:t>|   `-- utils.js                &lt;- AABB kolizija</w:t>
+            </w:r>
+          </w:p>
+          <w:p>
+            <w:pPr>
+              <w:spacing w:after="0"/>
+            </w:pPr>
             <w:r>
               <w:rPr>
                 <w:rFonts w:ascii="Courier New" w:hAnsi="Courier New" w:cs="Courier New"/>
                 <w:color w:val="E6E6E6"/>
                 <w:sz w:val="18"/>
               </w:rPr>
-              <w:t xml:space="preserve"> igraci, WS konekcije</w:t>
+              <w:t>|-- client/</w:t>
             </w:r>
           </w:p>
           <w:p>
@@ -7792,7 +7512,7 @@
                 <w:color w:val="E6E6E6"/>
                 <w:sz w:val="18"/>
               </w:rPr>
-              <w:t>|   |-- world/</w:t>
+              <w:t>|   |-- index.html</w:t>
             </w:r>
           </w:p>
           <w:p>
@@ -7805,7 +7525,7 @@
                 <w:color w:val="E6E6E6"/>
                 <w:sz w:val="18"/>
               </w:rPr>
-              <w:t>|   |   `-- map.js              &lt;- Zidovi, spawn tacke, zona prodavnice</w:t>
+              <w:t>|   |-- style.css</w:t>
             </w:r>
           </w:p>
           <w:p>
@@ -7818,7 +7538,7 @@
                 <w:color w:val="E6E6E6"/>
                 <w:sz w:val="18"/>
               </w:rPr>
-              <w:t>|   `-- utils.js                &lt;- AABB kolizija</w:t>
+              <w:t>|   |-- constants.js</w:t>
             </w:r>
           </w:p>
           <w:p>
@@ -7831,7 +7551,7 @@
                 <w:color w:val="E6E6E6"/>
                 <w:sz w:val="18"/>
               </w:rPr>
-              <w:t>|-- client/</w:t>
+              <w:t>|   |-- connection/</w:t>
             </w:r>
           </w:p>
           <w:p>
@@ -7844,7 +7564,7 @@
                 <w:color w:val="E6E6E6"/>
                 <w:sz w:val="18"/>
               </w:rPr>
-              <w:t>|   |-- index.html</w:t>
+              <w:t>|   |   |-- websocketManager.js</w:t>
             </w:r>
           </w:p>
           <w:p>
@@ -7857,7 +7577,7 @@
                 <w:color w:val="E6E6E6"/>
                 <w:sz w:val="18"/>
               </w:rPr>
-              <w:t>|   |-- style.css</w:t>
+              <w:t>|   |   `-- gameState.js</w:t>
             </w:r>
           </w:p>
           <w:p>
@@ -7870,7 +7590,7 @@
                 <w:color w:val="E6E6E6"/>
                 <w:sz w:val="18"/>
               </w:rPr>
-              <w:t>|   |-- constants.js</w:t>
+              <w:t>|   |-- logic/</w:t>
             </w:r>
           </w:p>
           <w:p>
@@ -7883,7 +7603,7 @@
                 <w:color w:val="E6E6E6"/>
                 <w:sz w:val="18"/>
               </w:rPr>
-              <w:t>|   |-- connection/</w:t>
+              <w:t>|   |   `-- input.js</w:t>
             </w:r>
           </w:p>
           <w:p>
@@ -7896,15 +7616,20 @@
                 <w:color w:val="E6E6E6"/>
                 <w:sz w:val="18"/>
               </w:rPr>
-              <w:t xml:space="preserve">|   |   </w:t>
-            </w:r>
+              <w:t>|   |-- UI/</w:t>
+            </w:r>
+          </w:p>
+          <w:p>
+            <w:pPr>
+              <w:spacing w:after="0"/>
+            </w:pPr>
             <w:r>
               <w:rPr>
                 <w:rFonts w:ascii="Courier New" w:hAnsi="Courier New" w:cs="Courier New"/>
                 <w:color w:val="E6E6E6"/>
                 <w:sz w:val="18"/>
               </w:rPr>
-              <w:t>|-- websocketManager.js</w:t>
+              <w:t>|   |   |-- draw.js, hud.js, shop.js</w:t>
             </w:r>
           </w:p>
           <w:p>
@@ -7917,7 +7642,7 @@
                 <w:color w:val="E6E6E6"/>
                 <w:sz w:val="18"/>
               </w:rPr>
-              <w:t>|   |   `-- gameState.js</w:t>
+              <w:t>|   |   `-- lobby.js, menu.js, screenManager.js</w:t>
             </w:r>
           </w:p>
           <w:p>
@@ -7930,7 +7655,7 @@
                 <w:color w:val="E6E6E6"/>
                 <w:sz w:val="18"/>
               </w:rPr>
-              <w:t>|   |-- logic/</w:t>
+              <w:t>|   `-- resources/audio/</w:t>
             </w:r>
           </w:p>
           <w:p>
@@ -7943,80 +7668,7 @@
                 <w:color w:val="E6E6E6"/>
                 <w:sz w:val="18"/>
               </w:rPr>
-              <w:t>|   |   `-- input.js</w:t>
-            </w:r>
-          </w:p>
-          <w:p>
-            <w:pPr>
-              <w:spacing w:after="0"/>
-            </w:pPr>
-            <w:r>
-              <w:rPr>
-                <w:rFonts w:ascii="Courier New" w:hAnsi="Courier New" w:cs="Courier New"/>
-                <w:color w:val="E6E6E6"/>
-                <w:sz w:val="18"/>
-              </w:rPr>
-              <w:t>|   |-- UI/</w:t>
-            </w:r>
-          </w:p>
-          <w:p>
-            <w:pPr>
-              <w:spacing w:after="0"/>
-            </w:pPr>
-            <w:r>
-              <w:rPr>
-                <w:rFonts w:ascii="Courier New" w:hAnsi="Courier New" w:cs="Courier New"/>
-                <w:color w:val="E6E6E6"/>
-                <w:sz w:val="18"/>
-              </w:rPr>
-              <w:t>|   |   |-- draw.js, hud.js, shop.js</w:t>
-            </w:r>
-          </w:p>
-          <w:p>
-            <w:pPr>
-              <w:spacing w:after="0"/>
-            </w:pPr>
-            <w:r>
-              <w:rPr>
-                <w:rFonts w:ascii="Courier New" w:hAnsi="Courier New" w:cs="Courier New"/>
-                <w:color w:val="E6E6E6"/>
-                <w:sz w:val="18"/>
-              </w:rPr>
-              <w:t>|   |   `-- lobby.js, menu.js, screenManager.js</w:t>
-            </w:r>
-          </w:p>
-          <w:p>
-            <w:pPr>
-              <w:spacing w:after="0"/>
-            </w:pPr>
-            <w:r>
-              <w:rPr>
-                <w:rFonts w:ascii="Courier New" w:hAnsi="Courier New" w:cs="Courier New"/>
-                <w:color w:val="E6E6E6"/>
-                <w:sz w:val="18"/>
-              </w:rPr>
-              <w:t>|   `-- resources/audio/</w:t>
-            </w:r>
-          </w:p>
-          <w:p>
-            <w:pPr>
-              <w:spacing w:after="0"/>
-            </w:pPr>
-            <w:r>
-              <w:rPr>
-                <w:rFonts w:ascii="Courier New" w:hAnsi="Courier New" w:cs="Courier New"/>
-                <w:color w:val="E6E6E6"/>
-                <w:sz w:val="18"/>
-              </w:rPr>
-              <w:t>`-- *.docx                      &lt;- Projektna doku</w:t>
-            </w:r>
-            <w:r>
-              <w:rPr>
-                <w:rFonts w:ascii="Courier New" w:hAnsi="Courier New" w:cs="Courier New"/>
-                <w:color w:val="E6E6E6"/>
-                <w:sz w:val="18"/>
-              </w:rPr>
-              <w:t>mentacija</w:t>
+              <w:t>`-- *.docx                      &lt;- Projektna dokumentacija</w:t>
             </w:r>
           </w:p>
         </w:tc>
@@ -8578,8 +8230,6 @@
         </w:rPr>
         <w:t xml:space="preserve">ta, uglavnom na srpskom jeziku, </w:t>
       </w:r>
-      <w:bookmarkStart w:id="0" w:name="_GoBack"/>
-      <w:bookmarkEnd w:id="0"/>
       <w:r>
         <w:rPr>
           <w:rFonts w:cs="Arial"/>
@@ -8692,15 +8342,7 @@
                 <w:color w:val="E6E6E6"/>
                 <w:sz w:val="18"/>
               </w:rPr>
-              <w:t>docs(readme)</w:t>
-            </w:r>
-            <w:r>
-              <w:rPr>
-                <w:rFonts w:ascii="Courier New" w:hAnsi="Courier New" w:cs="Courier New"/>
-                <w:color w:val="E6E6E6"/>
-                <w:sz w:val="18"/>
-              </w:rPr>
-              <w:t>:    azuriranje instrukcija za pokretanje servera</w:t>
+              <w:t>docs(readme):    azuriranje instrukcija za pokretanje servera</w:t>
             </w:r>
           </w:p>
           <w:p>
@@ -8942,14 +8584,7 @@
                 <w:rFonts w:cs="Arial"/>
                 <w:sz w:val="19"/>
               </w:rPr>
-              <w:t xml:space="preserve">Gubitak celog stanja </w:t>
-            </w:r>
-            <w:r>
-              <w:rPr>
-                <w:rFonts w:cs="Arial"/>
-                <w:sz w:val="19"/>
-              </w:rPr>
-              <w:t>igre pri restartu servera (nema baze ni perzistencije, sve je u memoriji procesa)</w:t>
+              <w:t>Gubitak celog stanja igre pri restartu servera (nema baze ni perzistencije, sve je u memoriji procesa)</w:t>
             </w:r>
           </w:p>
         </w:tc>
@@ -9050,14 +8685,7 @@
                 <w:rFonts w:cs="Arial"/>
                 <w:sz w:val="19"/>
               </w:rPr>
-              <w:t xml:space="preserve">Igrac koji izgubi konekciju trajno napusta sobu jer ne postoji </w:t>
-            </w:r>
-            <w:r>
-              <w:rPr>
-                <w:rFonts w:cs="Arial"/>
-                <w:sz w:val="19"/>
-              </w:rPr>
-              <w:t>logika ponovnog povezivanja</w:t>
+              <w:t>Igrac koji izgubi konekciju trajno napusta sobu jer ne postoji logika ponovnog povezivanja</w:t>
             </w:r>
           </w:p>
         </w:tc>
@@ -9230,14 +8858,7 @@
                 <w:rFonts w:cs="Arial"/>
                 <w:sz w:val="19"/>
               </w:rPr>
-              <w:t xml:space="preserve">Klijentska </w:t>
-            </w:r>
-            <w:r>
-              <w:rPr>
-                <w:rFonts w:cs="Arial"/>
-                <w:sz w:val="19"/>
-              </w:rPr>
-              <w:t>predikcija kretanja i prag korekcije od 60 px vec su implementirani; dalje poboljsanje kroz interpolaciju pozicija ostalih igraca</w:t>
+              <w:t>Klijentska predikcija kretanja i prag korekcije od 60 px vec su implementirani; dalje poboljsanje kroz interpolaciju pozicija ostalih igraca</w:t>
             </w:r>
           </w:p>
         </w:tc>
@@ -9338,14 +8959,7 @@
                 <w:rFonts w:cs="Arial"/>
                 <w:sz w:val="19"/>
               </w:rPr>
-              <w:t xml:space="preserve">Server je jedini autoritet za HP, novac i stetu; klijent nikad sam ne </w:t>
-            </w:r>
-            <w:r>
-              <w:rPr>
-                <w:rFonts w:cs="Arial"/>
-                <w:sz w:val="19"/>
-              </w:rPr>
-              <w:t>izracunava ove vrednosti</w:t>
+              <w:t>Server je jedini autoritet za HP, novac i stetu; klijent nikad sam ne izracunava ove vrednosti</w:t>
             </w:r>
           </w:p>
         </w:tc>
@@ -9475,14 +9089,7 @@
                 <w:rFonts w:cs="Arial"/>
                 <w:sz w:val="19"/>
               </w:rPr>
-              <w:t xml:space="preserve">Nedostatak </w:t>
-            </w:r>
-            <w:r>
-              <w:rPr>
-                <w:rFonts w:cs="Arial"/>
-                <w:sz w:val="19"/>
-              </w:rPr>
-              <w:t>automatizovanih testova otezava otkrivanje regresija pri izmeni balansa oruzja</w:t>
+              <w:t>Nedostatak automatizovanih testova otezava otkrivanje regresija pri izmeni balansa oruzja</w:t>
             </w:r>
           </w:p>
         </w:tc>
@@ -9655,14 +9262,7 @@
                 <w:rFonts w:cs="Arial"/>
                 <w:sz w:val="19"/>
               </w:rPr>
-              <w:t xml:space="preserve">Uvesti GitHub Actions za lint i testove </w:t>
-            </w:r>
-            <w:r>
-              <w:rPr>
-                <w:rFonts w:cs="Arial"/>
-                <w:sz w:val="19"/>
-              </w:rPr>
-              <w:t>pri svakom push-u (vidi sekciju 2.1)</w:t>
+              <w:t>Uvesti GitHub Actions za lint i testove pri svakom push-u (vidi sekciju 2.1)</w:t>
             </w:r>
           </w:p>
         </w:tc>
@@ -9817,7 +9417,7 @@
         <w:color w:val="595959"/>
         <w:sz w:val="18"/>
       </w:rPr>
-      <w:t>1</w:t>
+      <w:t>10</w:t>
     </w:r>
     <w:r>
       <w:rPr>
@@ -22537,7 +22137,7 @@
 </file>
 
 <file path=customXml/itemProps1.xml><?xml version="1.0" encoding="utf-8"?>
-<ds:datastoreItem xmlns:ds="http://schemas.openxmlformats.org/officeDocument/2006/customXml" ds:itemID="{BBFA9B8C-9C3B-4037-9B3F-D40275EADEEC}">
+<ds:datastoreItem xmlns:ds="http://schemas.openxmlformats.org/officeDocument/2006/customXml" ds:itemID="{3CC88D8A-AD2B-49A4-A4E3-B38DD59A17F1}">
   <ds:schemaRefs>
     <ds:schemaRef ds:uri="http://schemas.openxmlformats.org/officeDocument/2006/bibliography"/>
   </ds:schemaRefs>

</xml_diff>